<commit_message>
Update PPT, Word spec, and Architecture MD with ZEL name, Zero wait to leave zero wait to return tagline, and visual flows
</commit_message>
<xml_diff>
--- a/NICE_CXone_WFM_Copilot_Architecture_and_System_Design.docx
+++ b/NICE_CXone_WFM_Copilot_Architecture_and_System_Design.docx
@@ -13,7 +13,7 @@
           <w:color w:val="0A192F"/>
           <w:sz w:val="44"/>
         </w:rPr>
-        <w:t>NICE CXone Autonomous WFM &amp; AI Copilot Platform</w:t>
+        <w:t>ZEL: Autonomous WFM &amp; AI Copilot Platform</w:t>
         <w:br/>
         <w:t>System Architecture &amp; Technical Specification</w:t>
       </w:r>
@@ -25,13 +25,23 @@
       </w:pPr>
       <w:r>
         <w:rPr>
+          <w:b/>
+          <w:i/>
+          <w:color w:val="2563EB"/>
+          <w:sz w:val="26"/>
+        </w:rPr>
+        <w:t>“Zero wait to leave, zero wait to return”</w:t>
+        <w:br/>
+      </w:r>
+      <w:r>
+        <w:rPr>
           <w:i/>
           <w:color w:val="64748B"/>
-          <w:sz w:val="22"/>
+          <w:sz w:val="21"/>
         </w:rPr>
-        <w:t>Enterprise Auxiliary Mode Management, Intraday Telemetry, Dual Copilots &amp; Disaster Resilience</w:t>
+        <w:t>Enterprise Auxiliary Mode Management, Real-time Intraday Telemetry, Dual Copilots &amp; Surge Defense</w:t>
         <w:br/>
-        <w:t>Version 2.4 | Enterprise Architecture Specification</w:t>
+        <w:t>Version 2.5 | Enterprise Architecture Document</w:t>
       </w:r>
     </w:p>
     <w:p>
@@ -39,15 +49,17 @@
         <w:pStyle w:val="Heading1"/>
       </w:pPr>
       <w:r>
-        <w:t>1. Executive Summary</w:t>
+        <w:t>1. Executive Summary &amp; Brand Identity</w:t>
       </w:r>
     </w:p>
     <w:p>
       <w:r>
-        <w:t>The NICE CXone Autonomous Workforce Management (WFM) &amp; AI Copilot Platform transforms traditional contact center operations by bridging front-line agent auxiliary (AUX) state management with autonomous intraday floor governance. Historically, agent auxiliary states (lunch, tea, bio, technical downtime) were managed through rigid static rosters or manual approvals, creating hidden queue starvation, sudden service level agreement (SLA) degradations, and elevated agent burnout.</w:t>
+        <w:t>ZEL is an autonomous AI-powered Workforce Management (WFM) companion designed for NICE CXone contact centers. Built under the foundational philosophy of “Zero wait to leave, zero wait to return”, ZEL removes the administrative friction and anxiety associated with agent break schedules and emergency desk recalls.</w:t>
         <w:br/>
         <w:br/>
-        <w:t>This platform introduces an event-driven, dual-persona architecture comprising an always-on floating desktop companion for agents (AUXY) and a real-time command console for supervisors (REMI). Equipped with live Erlang-C capacity gating, automated ACW summarization, intraday cross-skilling rebalance algorithms, and front-end IVR disaster auto-deflection, the system delivers true autonomous queue protection.</w:t>
+        <w:t>• Zero Wait to Leave: Agents never wait 15–20 minutes in supervisor chat queues for break permission. With one click from their floating desktop widget, ZEL executes a microsecond Erlang-C capacity check. If floor queue depth allows (staffing capacity ≥80%), the break is granted instantly.</w:t>
+        <w:br/>
+        <w:t>• Zero Wait to Return: During rest intervals, ZEL provides an on-screen visual countdown timer. When shifts normalize or sudden volume surges occur, ZEL prompts agents or rings their softphone via automated text-to-speech desk recalls, ensuring prompt return without manual chasing.</w:t>
       </w:r>
     </w:p>
     <w:p>
@@ -55,12 +67,12 @@
         <w:pStyle w:val="Heading1"/>
       </w:pPr>
       <w:r>
-        <w:t>2. High-Level Architectural Overview</w:t>
+        <w:t>2. High-Level System Architecture</w:t>
       </w:r>
     </w:p>
     <w:p>
       <w:r>
-        <w:t>The system operates across four primary distributed tiers, ensuring sub-millisecond local desktop responsiveness, reliable real-time telemetry streaming, and seamless synchronization with existing NICE CXone MAX CTI infrastructure.</w:t>
+        <w:t>The ZEL platform operates across four distributed, event-driven tiers delivering sub-millisecond desktop responsiveness and enterprise telephony synchronization:</w:t>
       </w:r>
     </w:p>
     <w:tbl>
@@ -146,7 +158,7 @@
               <w:rPr>
                 <w:sz w:val="19"/>
               </w:rPr>
-              <w:t>Electron 30, HTML5, CSS3, SVG, Windows Shell API</w:t>
+              <w:t>Electron 30, HTML5, CSS3, SVG, Windows Taskbar API</w:t>
             </w:r>
           </w:p>
         </w:tc>
@@ -160,7 +172,7 @@
               <w:rPr>
                 <w:sz w:val="19"/>
               </w:rPr>
-              <w:t>Floating CTI desktop widget, Agent Workstation, Break Portal, and Supervisor Command Center.</w:t>
+              <w:t>ZEL Floating CTI Desktop Widget, Agent Workstation, Break Portal, and Supervisor Command Console.</w:t>
             </w:r>
           </w:p>
         </w:tc>
@@ -204,7 +216,7 @@
               <w:rPr>
                 <w:sz w:val="19"/>
               </w:rPr>
-              <w:t>Sub-millisecond P2P client state broadcast ('wfm_aux_channel'), event logging, and RESTful routing.</w:t>
+              <w:t>P2P microsecond client synchronization ('wfm_aux_channel'), policy updates, and scoped supervisor routing.</w:t>
             </w:r>
           </w:p>
         </w:tc>
@@ -220,7 +232,7 @@
               <w:rPr>
                 <w:sz w:val="19"/>
               </w:rPr>
-              <w:t>Tier 3: Analytical &amp; Intelligence Core</w:t>
+              <w:t>Tier 3: Analytical Core &amp; Intelligence</w:t>
             </w:r>
           </w:p>
         </w:tc>
@@ -234,7 +246,7 @@
               <w:rPr>
                 <w:sz w:val="19"/>
               </w:rPr>
-              <w:t>Erlang-C Engine, AI Speech Tone Model, Copilot NLP</w:t>
+              <w:t>Erlang-C Engine, AI Speech Sentiment, ZEL Copilot NLP</w:t>
             </w:r>
           </w:p>
         </w:tc>
@@ -248,7 +260,7 @@
               <w:rPr>
                 <w:sz w:val="19"/>
               </w:rPr>
-              <w:t>Mathematical break capacity gating, speech emotion auditing, 360° agent dossiers, and surge balancing.</w:t>
+              <w:t>Mathematical break capacity gating, speech emotion detection, agent 360° dossiers, and surge balancing.</w:t>
             </w:r>
           </w:p>
         </w:tc>
@@ -264,7 +276,7 @@
               <w:rPr>
                 <w:sz w:val="19"/>
               </w:rPr>
-              <w:t>Tier 4: Telephony &amp; CTI Integration</w:t>
+              <w:t>Tier 4: Telephony &amp; CTI Infrastructure</w:t>
             </w:r>
           </w:p>
         </w:tc>
@@ -292,7 +304,7 @@
               <w:rPr>
                 <w:sz w:val="19"/>
               </w:rPr>
-              <w:t>Telephony state tracking (Available, Working, AUX, ACW), automated voice bot desk recalls, and disaster IVR.</w:t>
+              <w:t>Telephony state engine (Available, Working, AUX, ACW), automated voice bot desk recalls, and storm IVR.</w:t>
             </w:r>
           </w:p>
         </w:tc>
@@ -308,55 +320,31 @@
         <w:pStyle w:val="Heading1"/>
       </w:pPr>
       <w:r>
-        <w:t>3. Core Subsystems &amp; Functional Capabilities</w:t>
+        <w:t>3. The Frictionless 4-Step ZEL Workflow</w:t>
+      </w:r>
+    </w:p>
+    <w:p>
+      <w:r>
+        <w:t>1. Step 1 (1-Click Request): Agent clicks Tea, Bio, Lunch, or System Issue directly inside the floating ZEL widget.</w:t>
+        <w:br/>
+        <w:t>2. Step 2 (Instant Erlang-C Gating): In &lt;100ms, the mathematical engine checks active queue arrival rates and required staffing. If capacity permits, the break is approved immediately with zero supervisor latency.</w:t>
+        <w:br/>
+        <w:t>3. Step 3 (Rest Interval Tracking): The desktop companion displays an adherence countdown timer, protecting rest and tracking compliance.</w:t>
+        <w:br/>
+        <w:t>4. Step 4 (Prompt Return): As the interval ends or in the event of an intraday surge, ZEL alerts the agent via audio prompt or voice bot recall, facilitating an immediate 1-click return to the Available call state.</w:t>
       </w:r>
     </w:p>
     <w:p>
       <w:pPr>
-        <w:pStyle w:val="Heading2"/>
+        <w:pStyle w:val="Heading1"/>
       </w:pPr>
       <w:r>
-        <w:t>3.1. Agent Desktop AI Copilot (AUXY)</w:t>
+        <w:t>4. Scoped Supervisor-to-Agent Governance Matrix</w:t>
       </w:r>
     </w:p>
     <w:p>
       <w:r>
-        <w:t>The agent client floats seamlessly alongside enterprise CRM and softphone interfaces:</w:t>
-        <w:br/>
-        <w:t>• Instant ACW Summarizer: Automatically formats customer intent, troubleshooting steps, and agreed resolution into concise CRM notes.</w:t>
-        <w:br/>
-        <w:t>• Live Speech Tone Suggestions: Detects rising customer frustration and injects polite, de-escalation objection responses.</w:t>
-        <w:br/>
-        <w:t>• Autonomous Discretionary Break Portal: Agents apply for tea or bio breaks with instant Erlang-C traffic verification.</w:t>
-        <w:br/>
-        <w:t>• IT System Issue Gateway (AUX-5): Direct incident logging for Citrix latency, VPN disconnects, and audio packet loss.</w:t>
-      </w:r>
-    </w:p>
-    <w:p>
-      <w:pPr>
-        <w:pStyle w:val="Heading2"/>
-      </w:pPr>
-      <w:r>
-        <w:t>3.2. Supervisor Command Center &amp; Scoped Team Governance</w:t>
-      </w:r>
-    </w:p>
-    <w:p>
-      <w:r>
-        <w:t>Supervisors access an executive telemetry console configured with role-based access and scoped agent rosters:</w:t>
-        <w:br/>
-        <w:t>• Scoped Team Filtering: Floor wallboards and telemetry display agents tagged to the specific active supervisor.</w:t>
-        <w:br/>
-        <w:t>• Automated Voice Bot Desk Recall: Supervisors dispatch automated text-to-speech calls directly to the agent's desktop widget.</w:t>
-        <w:br/>
-        <w:t>• QA Sentiment &amp; Coaching Scorecard: Audits customer sentiment (Empathetic, Neutral, Rude, Bad) and dispatches LMS coaching modules.</w:t>
-      </w:r>
-    </w:p>
-    <w:p>
-      <w:pPr>
-        <w:pStyle w:val="Heading2"/>
-      </w:pPr>
-      <w:r>
-        <w:t>3.3. Supervisor-to-Agent Tagging Matrix</w:t>
+        <w:t>ZEL dynamically scopes floor telemetry, break approvals, reports, and QA scorecards to each supervisor's assigned team:</w:t>
       </w:r>
     </w:p>
     <w:tbl>
@@ -397,7 +385,7 @@
                 <w:b/>
                 <w:color w:val="FFFFFF"/>
               </w:rPr>
-              <w:t>Role / Queue Specialization</w:t>
+              <w:t>Role / Focus Area</w:t>
             </w:r>
           </w:p>
         </w:tc>
@@ -442,7 +430,7 @@
               <w:rPr>
                 <w:sz w:val="19"/>
               </w:rPr>
-              <w:t>Floor Operations &amp; Customer Service Lead</w:t>
+              <w:t>Floor Lead &amp; Customer Service</w:t>
             </w:r>
           </w:p>
         </w:tc>
@@ -645,49 +633,23 @@
     </w:p>
     <w:p>
       <w:pPr>
-        <w:pStyle w:val="Heading2"/>
+        <w:pStyle w:val="Heading1"/>
       </w:pPr>
       <w:r>
-        <w:t>3.4. Dynamic Skill Flex &amp; Surge Defense Algorithm</w:t>
+        <w:t>5. Quantifiable Business Value &amp; ROI</w:t>
       </w:r>
     </w:p>
     <w:p>
       <w:r>
-        <w:t>When sudden billing surges occur (+318 calls waiting, ASA spikes to 9 minutes, SLA drops to 34.5%), the WFM engine calculates an Erlang-C staffing deficit (+4 required). In one click (or autonomous auto-flex), the engine reallocates three certified cross-skilled Customer Service agents (Samantha Vance, Rachel Green, Marcus Brody) to the Billing queue. Calls waiting immediately collapse to 48, restoring SLA to 88.5% without overtime expense.</w:t>
-      </w:r>
-    </w:p>
-    <w:p>
-      <w:pPr>
-        <w:pStyle w:val="Heading2"/>
-      </w:pPr>
-      <w:r>
-        <w:t>3.5. Storm Disaster IVR Auto-Deflection Engine</w:t>
-      </w:r>
-    </w:p>
-    <w:p>
-      <w:r>
-        <w:t>During severe weather disasters or power grid disruptions, incoming call arrivals can flood past 1,000 calls/min. The auto-deflection engine evaluates incoming rates in real time. Starting from call 1001 onwards, callers receive an automated text-to-speech announcement explaining field crew dispatches and advising courtesy credits. When traffic normalizes below 1,000 calls/min, standard ACD routing resumes automatically.</w:t>
-      </w:r>
-    </w:p>
-    <w:p>
-      <w:pPr>
-        <w:pStyle w:val="Heading1"/>
-      </w:pPr>
-      <w:r>
-        <w:t>4. Business Value &amp; Measurable ROI</w:t>
-      </w:r>
-    </w:p>
-    <w:p>
-      <w:r>
-        <w:t>Deployments of the NICE CXone Autonomous WFM &amp; Copilot platform yield measurable operational returns:</w:t>
+        <w:t>• 0 Seconds Approval Latency: Replaces 15–20 minutes of chat delay with instant Erlang-C automated grants.</w:t>
         <w:br/>
-        <w:t>• +18.4% Fleet Adherence Gain: Elimination of uncoordinated break clusters and adherence policy drift.</w:t>
+        <w:t>• -45 Seconds ACW Handle Time: Automated AI call summarization cuts CRM wrap-up time in half.</w:t>
         <w:br/>
-        <w:t>• 50% ACW Time Reduction: Automated note generation drops average after-call work from 68s to 34s.</w:t>
+        <w:t>• +18.4% Schedule Adherence Gain: Eliminates uncoordinated break drift and policy violations.</w:t>
         <w:br/>
-        <w:t>• Rapid SLA Recovery: Queue load balancing restores critically degraded queues within 3 minutes.</w:t>
+        <w:t>• Instant Surge Recovery (34% ➔ 89% SLA): Reallocates certified cross-skilled agents in under 3 minutes.</w:t>
         <w:br/>
-        <w:t>• Agent Retention &amp; Fatigue Protection: Proactive burnout scoring flags excessive consecutive call handling.</w:t>
+        <w:t>• 1,000 Calls/Min Disaster Protection: Auto-deflects storm traffic with automated voice announcements.</w:t>
       </w:r>
     </w:p>
     <w:sectPr>

</xml_diff>